<commit_message>
Sync Massi's and Leon's edits across all GEO documents
Wächter page renamed to Laufende Website-Prüfung with Prüfbericht,
meta description variants and blog title from M12, lawyer step removed
from E3, M9 marked as idea, Plausible flagged as open. Restores still
valid points from plan v1: blog H1 fix, person markup, LinkedIn cleanup,
ClaimGuard is smugo.

Co-Authored-By: Claude Opus 5.5 <noreply@anthropic.com>
Claude-Session: https://claude.ai/code/session_01NMQaoUeHEbPLTJ9CdvHzwP
</commit_message>
<xml_diff>
--- a/reports/2026-10-28_GEO/Fragen_Rankings_Wettbewerb.docx
+++ b/reports/2026-10-28_GEO/Fragen_Rankings_Wettbewerb.docx
@@ -5375,7 +5375,7 @@
           <w:sz w:val="20"/>
           <w:szCs w:val="20"/>
         </w:rPr>
-        <w:t xml:space="preserve"> Eckada und PageCompliance liegen vorn, vor Dr. Kaske, AppCore und dem HWG Check von leema. Caidera kommt nicht vor. Nur bei Perplexity tauchen auf: Regly, Cape.io, Improvado, Typetone, Consileon, KI Marketing Studio, Behr’s Digital Health &amp; Nutrition Claims, ClaimGuard, Supplement-Check.eu.</w:t>
+        <w:t xml:space="preserve"> Eckada und PageCompliance liegen vorn, vor Dr. Kaske, AppCore und dem HWG Check von leema. Caidera kommt nicht vor. Nur bei Perplexity tauchen auf: Regly, Cape.io, Improvado, Typetone, Consileon, KI Marketing Studio, Behr’s Digital Health &amp; Nutrition Claims, ClaimGuard, Supplement-Check.eu. ClaimGuard ist laut Plan v1 der englische Name von smugos HWG-Wächter, also kein eigener Wettbewerber.</w:t>
       </w:r>
     </w:p>
     <w:p>
@@ -11975,7 +11975,7 @@
                 <w:sz w:val="14"/>
                 <w:szCs w:val="14"/>
               </w:rPr>
-              <w:t xml:space="preserve">smugo („HWG-Wächter“)</w:t>
+              <w:t xml:space="preserve">smugo („HWG-Wächter“, englisch „ClaimGuard“)</w:t>
             </w:r>
           </w:p>
         </w:tc>

</xml_diff>